<commit_message>
feat: rewrite resume with measured outcomes
Lead each role with sourced metrics (ShieldTX volume, recovery, latency;
Nexus npm downloads; GAMP scale), situation-first bullets, ATS keywords
in context, a one-line AI-native summary, and grouped skills.
</commit_message>
<xml_diff>
--- a/output/docx/amartya-singh-product-engineer-resume.docx
+++ b/output/docx/amartya-singh-product-engineer-resume.docx
@@ -34,7 +34,7 @@
     </w:p>
     <w:p>
       <w:pPr>
-        <w:spacing w:before="0" w:after="88" w:line="240" w:lineRule="auto"/>
+        <w:spacing w:before="0" w:after="60" w:line="240" w:lineRule="auto"/>
       </w:pPr>
       <w:r>
         <w:rPr>
@@ -137,6 +137,61 @@
     </w:p>
     <w:p>
       <w:pPr>
+        <w:spacing w:before="0" w:after="88" w:line="240" w:lineRule="auto"/>
+      </w:pPr>
+      <w:r>
+        <w:rPr>
+          <w:rFonts w:ascii="Arial" w:hAnsi="Arial"/>
+          <w:b w:val="0"/>
+          <w:i w:val="0"/>
+          <w:color w:val="121212"/>
+          <w:sz w:val="20"/>
+        </w:rPr>
+        <w:t xml:space="preserve">Full-stack product engineer, </w:t>
+      </w:r>
+      <w:r>
+        <w:rPr>
+          <w:rFonts w:ascii="Arial" w:hAnsi="Arial"/>
+          <w:b/>
+          <w:i w:val="0"/>
+          <w:color w:val="121212"/>
+          <w:sz w:val="20"/>
+        </w:rPr>
+        <w:t>4+ years</w:t>
+      </w:r>
+      <w:r>
+        <w:rPr>
+          <w:rFonts w:ascii="Arial" w:hAnsi="Arial"/>
+          <w:b w:val="0"/>
+          <w:i w:val="0"/>
+          <w:color w:val="121212"/>
+          <w:sz w:val="20"/>
+        </w:rPr>
+        <w:t xml:space="preserve">, </w:t>
+      </w:r>
+      <w:r>
+        <w:rPr>
+          <w:rFonts w:ascii="Arial" w:hAnsi="Arial"/>
+          <w:b/>
+          <w:i w:val="0"/>
+          <w:color w:val="121212"/>
+          <w:sz w:val="20"/>
+        </w:rPr>
+        <w:t>AI-native</w:t>
+      </w:r>
+      <w:r>
+        <w:rPr>
+          <w:rFonts w:ascii="Arial" w:hAnsi="Arial"/>
+          <w:b w:val="0"/>
+          <w:i w:val="0"/>
+          <w:color w:val="121212"/>
+          <w:sz w:val="20"/>
+        </w:rPr>
+        <w:t xml:space="preserve"> (Claude Code, Codex, agent skills, LLM products).</w:t>
+      </w:r>
+    </w:p>
+    <w:p>
+      <w:pPr>
         <w:spacing w:before="210" w:after="80" w:line="240" w:lineRule="auto"/>
         <w:keepNext/>
         <w:pBdr>
@@ -228,7 +283,67 @@
           <w:color w:val="121212"/>
           <w:sz w:val="20"/>
         </w:rPr>
-        <w:t>Own the backend coordination layer for ShieldTX, a privacy-preserving trading product on Hyperliquid, covering trading workflows, live market connections, third-party integrations, operational tooling, and the frontend API.</w:t>
+        <w:t xml:space="preserve">Proposed and architected </w:t>
+      </w:r>
+      <w:r>
+        <w:rPr>
+          <w:rFonts w:ascii="Arial" w:hAnsi="Arial"/>
+          <w:b/>
+          <w:i w:val="0"/>
+          <w:color w:val="121212"/>
+          <w:sz w:val="20"/>
+        </w:rPr>
+        <w:t>ShieldTX</w:t>
+      </w:r>
+      <w:r>
+        <w:rPr>
+          <w:rFonts w:ascii="Arial" w:hAnsi="Arial"/>
+          <w:b w:val="0"/>
+          <w:i w:val="0"/>
+          <w:color w:val="121212"/>
+          <w:sz w:val="20"/>
+        </w:rPr>
+        <w:t xml:space="preserve">'s backend coordination layer (TypeScript, Bun, PostgreSQL) for private trading on Hyperliquid; it has processed </w:t>
+      </w:r>
+      <w:r>
+        <w:rPr>
+          <w:rFonts w:ascii="Arial" w:hAnsi="Arial"/>
+          <w:b/>
+          <w:i w:val="0"/>
+          <w:color w:val="121212"/>
+          <w:sz w:val="20"/>
+        </w:rPr>
+        <w:t>$2.3M+ in executed volume</w:t>
+      </w:r>
+      <w:r>
+        <w:rPr>
+          <w:rFonts w:ascii="Arial" w:hAnsi="Arial"/>
+          <w:b w:val="0"/>
+          <w:i w:val="0"/>
+          <w:color w:val="121212"/>
+          <w:sz w:val="20"/>
+        </w:rPr>
+        <w:t xml:space="preserve"> across </w:t>
+      </w:r>
+      <w:r>
+        <w:rPr>
+          <w:rFonts w:ascii="Arial" w:hAnsi="Arial"/>
+          <w:b/>
+          <w:i w:val="0"/>
+          <w:color w:val="121212"/>
+          <w:sz w:val="20"/>
+        </w:rPr>
+        <w:t>1,300+ trades</w:t>
+      </w:r>
+      <w:r>
+        <w:rPr>
+          <w:rFonts w:ascii="Arial" w:hAnsi="Arial"/>
+          <w:b w:val="0"/>
+          <w:i w:val="0"/>
+          <w:color w:val="121212"/>
+          <w:sz w:val="20"/>
+        </w:rPr>
+        <w:t xml:space="preserve"> since June 2026.</w:t>
       </w:r>
     </w:p>
     <w:p>
@@ -245,7 +360,67 @@
           <w:color w:val="121212"/>
           <w:sz w:val="20"/>
         </w:rPr>
-        <w:t>Architected the first coordination service and evolved its lifecycle, external-evidence, and recovery paths so multi-service trades can be resumed and operated safely.</w:t>
+        <w:t xml:space="preserve">When interrupted trades stranded user funds, built event-driven recovery workflows for failed opens, closes, and liquidations that returned </w:t>
+      </w:r>
+      <w:r>
+        <w:rPr>
+          <w:rFonts w:ascii="Arial" w:hAnsi="Arial"/>
+          <w:b/>
+          <w:i w:val="0"/>
+          <w:color w:val="121212"/>
+          <w:sz w:val="20"/>
+        </w:rPr>
+        <w:t>$19K+</w:t>
+      </w:r>
+      <w:r>
+        <w:rPr>
+          <w:rFonts w:ascii="Arial" w:hAnsi="Arial"/>
+          <w:b w:val="0"/>
+          <w:i w:val="0"/>
+          <w:color w:val="121212"/>
+          <w:sz w:val="20"/>
+        </w:rPr>
+        <w:t xml:space="preserve"> across </w:t>
+      </w:r>
+      <w:r>
+        <w:rPr>
+          <w:rFonts w:ascii="Arial" w:hAnsi="Arial"/>
+          <w:b/>
+          <w:i w:val="0"/>
+          <w:color w:val="121212"/>
+          <w:sz w:val="20"/>
+        </w:rPr>
+        <w:t>132 operations</w:t>
+      </w:r>
+      <w:r>
+        <w:rPr>
+          <w:rFonts w:ascii="Arial" w:hAnsi="Arial"/>
+          <w:b w:val="0"/>
+          <w:i w:val="0"/>
+          <w:color w:val="121212"/>
+          <w:sz w:val="20"/>
+        </w:rPr>
+        <w:t xml:space="preserve"> and cut open failures from </w:t>
+      </w:r>
+      <w:r>
+        <w:rPr>
+          <w:rFonts w:ascii="Arial" w:hAnsi="Arial"/>
+          <w:b/>
+          <w:i w:val="0"/>
+          <w:color w:val="121212"/>
+          <w:sz w:val="20"/>
+        </w:rPr>
+        <w:t>19% to 3%</w:t>
+      </w:r>
+      <w:r>
+        <w:rPr>
+          <w:rFonts w:ascii="Arial" w:hAnsi="Arial"/>
+          <w:b w:val="0"/>
+          <w:i w:val="0"/>
+          <w:color w:val="121212"/>
+          <w:sz w:val="20"/>
+        </w:rPr>
+        <w:t xml:space="preserve"> in two months.</w:t>
       </w:r>
     </w:p>
     <w:p>
@@ -262,7 +437,67 @@
           <w:color w:val="121212"/>
           <w:sz w:val="20"/>
         </w:rPr>
-        <w:t>Architected the initial Nexus SDK in TypeScript and built React integration surfaces for cross-chain bridge, send, swap, and execute flows.</w:t>
+        <w:t xml:space="preserve">Early releases took </w:t>
+      </w:r>
+      <w:r>
+        <w:rPr>
+          <w:rFonts w:ascii="Arial" w:hAnsi="Arial"/>
+          <w:b/>
+          <w:i w:val="0"/>
+          <w:color w:val="121212"/>
+          <w:sz w:val="20"/>
+        </w:rPr>
+        <w:t>~20s</w:t>
+      </w:r>
+      <w:r>
+        <w:rPr>
+          <w:rFonts w:ascii="Arial" w:hAnsi="Arial"/>
+          <w:b w:val="0"/>
+          <w:i w:val="0"/>
+          <w:color w:val="121212"/>
+          <w:sz w:val="20"/>
+        </w:rPr>
+        <w:t xml:space="preserve"> to open a position; replaced polling with streamed exchange confirmations and parallelized preflight reads to cut that to </w:t>
+      </w:r>
+      <w:r>
+        <w:rPr>
+          <w:rFonts w:ascii="Arial" w:hAnsi="Arial"/>
+          <w:b/>
+          <w:i w:val="0"/>
+          <w:color w:val="121212"/>
+          <w:sz w:val="20"/>
+        </w:rPr>
+        <w:t>~5s</w:t>
+      </w:r>
+      <w:r>
+        <w:rPr>
+          <w:rFonts w:ascii="Arial" w:hAnsi="Arial"/>
+          <w:b w:val="0"/>
+          <w:i w:val="0"/>
+          <w:color w:val="121212"/>
+          <w:sz w:val="20"/>
+        </w:rPr>
+        <w:t xml:space="preserve">, and brought median close time from </w:t>
+      </w:r>
+      <w:r>
+        <w:rPr>
+          <w:rFonts w:ascii="Arial" w:hAnsi="Arial"/>
+          <w:b/>
+          <w:i w:val="0"/>
+          <w:color w:val="121212"/>
+          <w:sz w:val="20"/>
+        </w:rPr>
+        <w:t>7.5s to 2.7s</w:t>
+      </w:r>
+      <w:r>
+        <w:rPr>
+          <w:rFonts w:ascii="Arial" w:hAnsi="Arial"/>
+          <w:b w:val="0"/>
+          <w:i w:val="0"/>
+          <w:color w:val="121212"/>
+          <w:sz w:val="20"/>
+        </w:rPr>
+        <w:t>.</w:t>
       </w:r>
     </w:p>
     <w:p>
@@ -279,7 +514,7 @@
           <w:color w:val="121212"/>
           <w:sz w:val="20"/>
         </w:rPr>
-        <w:t>Rebuilt Nexus UI as source-owned shadcn components distributed through a registry, and built Nexus Elements to make the components installable and customizable.</w:t>
+        <w:t>To give the team visibility into live operations, built internal ops tooling (React, Hono, Drizzle) for investigating stuck trades, monitoring platform health, and running refunds and fund recovery.</w:t>
       </w:r>
     </w:p>
     <w:p>
@@ -296,7 +531,84 @@
           <w:color w:val="121212"/>
           <w:sz w:val="20"/>
         </w:rPr>
-        <w:t>Automated versioning, changelogs, and npm publishing through a custom release CLI, and established review standards for the TypeScript and React codebase.</w:t>
+        <w:t xml:space="preserve">Shipped automatic withdrawal claiming in the Next.js trading frontend, removing a manual claim step, and coalesced portfolio refreshes to cut redundant reads by </w:t>
+      </w:r>
+      <w:r>
+        <w:rPr>
+          <w:rFonts w:ascii="Arial" w:hAnsi="Arial"/>
+          <w:b/>
+          <w:i w:val="0"/>
+          <w:color w:val="121212"/>
+          <w:sz w:val="20"/>
+        </w:rPr>
+        <w:t>88%</w:t>
+      </w:r>
+      <w:r>
+        <w:rPr>
+          <w:rFonts w:ascii="Arial" w:hAnsi="Arial"/>
+          <w:b w:val="0"/>
+          <w:i w:val="0"/>
+          <w:color w:val="121212"/>
+          <w:sz w:val="20"/>
+        </w:rPr>
+        <w:t xml:space="preserve"> during settlement bursts.</w:t>
+      </w:r>
+    </w:p>
+    <w:p>
+      <w:pPr>
+        <w:pStyle w:val="ListBullet"/>
+        <w:spacing w:before="0" w:after="31" w:line="251" w:lineRule="auto"/>
+        <w:ind w:left="260" w:hanging="180"/>
+      </w:pPr>
+      <w:r>
+        <w:rPr>
+          <w:rFonts w:ascii="Arial" w:hAnsi="Arial"/>
+          <w:b w:val="0"/>
+          <w:i w:val="0"/>
+          <w:color w:val="121212"/>
+          <w:sz w:val="20"/>
+        </w:rPr>
+        <w:t xml:space="preserve">Built the initial </w:t>
+      </w:r>
+      <w:r>
+        <w:rPr>
+          <w:rFonts w:ascii="Arial" w:hAnsi="Arial"/>
+          <w:b/>
+          <w:i w:val="0"/>
+          <w:color w:val="121212"/>
+          <w:sz w:val="20"/>
+        </w:rPr>
+        <w:t>Nexus</w:t>
+      </w:r>
+      <w:r>
+        <w:rPr>
+          <w:rFonts w:ascii="Arial" w:hAnsi="Arial"/>
+          <w:b w:val="0"/>
+          <w:i w:val="0"/>
+          <w:color w:val="121212"/>
+          <w:sz w:val="20"/>
+        </w:rPr>
+        <w:t xml:space="preserve"> TypeScript SDK and React integration for cross-chain flows; when the bundled UI limited customization, split it into shadcn registry components integrators own and edit (</w:t>
+      </w:r>
+      <w:r>
+        <w:rPr>
+          <w:rFonts w:ascii="Arial" w:hAnsi="Arial"/>
+          <w:b/>
+          <w:i w:val="0"/>
+          <w:color w:val="121212"/>
+          <w:sz w:val="20"/>
+        </w:rPr>
+        <w:t>60K+ npm downloads</w:t>
+      </w:r>
+      <w:r>
+        <w:rPr>
+          <w:rFonts w:ascii="Arial" w:hAnsi="Arial"/>
+          <w:b w:val="0"/>
+          <w:i w:val="0"/>
+          <w:color w:val="121212"/>
+          <w:sz w:val="20"/>
+        </w:rPr>
+        <w:t>).</w:t>
       </w:r>
     </w:p>
     <w:p>
@@ -373,7 +685,27 @@
           <w:color w:val="121212"/>
           <w:sz w:val="20"/>
         </w:rPr>
-        <w:t>Led frontend delivery during a pivot from a Web3 marketplace to social gaming, helping ship the working MVP in 21 days.</w:t>
+        <w:t xml:space="preserve">When GAMP pivoted from a Web3 marketplace to social gaming, shipped the new MVP in </w:t>
+      </w:r>
+      <w:r>
+        <w:rPr>
+          <w:rFonts w:ascii="Arial" w:hAnsi="Arial"/>
+          <w:b/>
+          <w:i w:val="0"/>
+          <w:color w:val="121212"/>
+          <w:sz w:val="20"/>
+        </w:rPr>
+        <w:t>21 days</w:t>
+      </w:r>
+      <w:r>
+        <w:rPr>
+          <w:rFonts w:ascii="Arial" w:hAnsi="Arial"/>
+          <w:b w:val="0"/>
+          <w:i w:val="0"/>
+          <w:color w:val="121212"/>
+          <w:sz w:val="20"/>
+        </w:rPr>
+        <w:t xml:space="preserve"> as one of two frontend engineers, with tournaments, profiles, buddies, rewards, and 5 game integrations.</w:t>
       </w:r>
     </w:p>
     <w:p>
@@ -390,7 +722,47 @@
           <w:color w:val="121212"/>
           <w:sz w:val="20"/>
         </w:rPr>
-        <w:t>Built Rewards, Events, Buddies, and Notifications as the platform scaled to approximately 100K users and 10K wallets.</w:t>
+        <w:t xml:space="preserve">Built Rewards, Events, Buddies, and Notifications as GAMP grew to </w:t>
+      </w:r>
+      <w:r>
+        <w:rPr>
+          <w:rFonts w:ascii="Arial" w:hAnsi="Arial"/>
+          <w:b/>
+          <w:i w:val="0"/>
+          <w:color w:val="121212"/>
+          <w:sz w:val="20"/>
+        </w:rPr>
+        <w:t>100K users</w:t>
+      </w:r>
+      <w:r>
+        <w:rPr>
+          <w:rFonts w:ascii="Arial" w:hAnsi="Arial"/>
+          <w:b w:val="0"/>
+          <w:i w:val="0"/>
+          <w:color w:val="121212"/>
+          <w:sz w:val="20"/>
+        </w:rPr>
+        <w:t xml:space="preserve"> and </w:t>
+      </w:r>
+      <w:r>
+        <w:rPr>
+          <w:rFonts w:ascii="Arial" w:hAnsi="Arial"/>
+          <w:b/>
+          <w:i w:val="0"/>
+          <w:color w:val="121212"/>
+          <w:sz w:val="20"/>
+        </w:rPr>
+        <w:t>110M+ gameplay events</w:t>
+      </w:r>
+      <w:r>
+        <w:rPr>
+          <w:rFonts w:ascii="Arial" w:hAnsi="Arial"/>
+          <w:b w:val="0"/>
+          <w:i w:val="0"/>
+          <w:color w:val="121212"/>
+          <w:sz w:val="20"/>
+        </w:rPr>
+        <w:t>.</w:t>
       </w:r>
     </w:p>
     <w:p>
@@ -407,7 +779,47 @@
           <w:color w:val="121212"/>
           <w:sz w:val="20"/>
         </w:rPr>
-        <w:t>Integrated Riot authentication and Openfort embedded wallets with session keys; reduced wallet-provisioning latency by approximately 60% through Puppeteer automation.</w:t>
+        <w:t xml:space="preserve">To keep crypto invisible to gamers, led the Riot sign-in and Openfort embedded-wallet integration with session keys, provisioning </w:t>
+      </w:r>
+      <w:r>
+        <w:rPr>
+          <w:rFonts w:ascii="Arial" w:hAnsi="Arial"/>
+          <w:b/>
+          <w:i w:val="0"/>
+          <w:color w:val="121212"/>
+          <w:sz w:val="20"/>
+        </w:rPr>
+        <w:t>10K+ wallets</w:t>
+      </w:r>
+      <w:r>
+        <w:rPr>
+          <w:rFonts w:ascii="Arial" w:hAnsi="Arial"/>
+          <w:b w:val="0"/>
+          <w:i w:val="0"/>
+          <w:color w:val="121212"/>
+          <w:sz w:val="20"/>
+        </w:rPr>
+        <w:t xml:space="preserve">; cut provisioning time from </w:t>
+      </w:r>
+      <w:r>
+        <w:rPr>
+          <w:rFonts w:ascii="Arial" w:hAnsi="Arial"/>
+          <w:b/>
+          <w:i w:val="0"/>
+          <w:color w:val="121212"/>
+          <w:sz w:val="20"/>
+        </w:rPr>
+        <w:t>60s to 15s</w:t>
+      </w:r>
+      <w:r>
+        <w:rPr>
+          <w:rFonts w:ascii="Arial" w:hAnsi="Arial"/>
+          <w:b w:val="0"/>
+          <w:i w:val="0"/>
+          <w:color w:val="121212"/>
+          <w:sz w:val="20"/>
+        </w:rPr>
+        <w:t xml:space="preserve"> with Puppeteer automation.</w:t>
       </w:r>
     </w:p>
     <w:p>
@@ -484,7 +896,24 @@
           <w:color w:val="121212"/>
           <w:sz w:val="20"/>
         </w:rPr>
-        <w:t>Built a Cleartrip-partner hotel booking platform across search, booking, payments, maps, and Paytm/Cleartrip integrations; developed REST APIs, optimized SQL queries, and refactored client state with Redux Toolkit.</w:t>
+        <w:t>Built search, booking, and payment flows for a Cleartrip-partner hotel booking platform, integrating Paytm payments, Cleartrip inventory, and maps.</w:t>
+      </w:r>
+    </w:p>
+    <w:p>
+      <w:pPr>
+        <w:pStyle w:val="ListBullet"/>
+        <w:spacing w:before="0" w:after="31" w:line="251" w:lineRule="auto"/>
+        <w:ind w:left="260" w:hanging="180"/>
+      </w:pPr>
+      <w:r>
+        <w:rPr>
+          <w:rFonts w:ascii="Arial" w:hAnsi="Arial"/>
+          <w:b w:val="0"/>
+          <w:i w:val="0"/>
+          <w:color w:val="121212"/>
+          <w:sz w:val="20"/>
+        </w:rPr>
+        <w:t>Wrote REST APIs, optimized SQL queries, and moved client state to Redux Toolkit.</w:t>
       </w:r>
     </w:p>
     <w:p>
@@ -561,67 +990,47 @@
           <w:color w:val="121212"/>
           <w:sz w:val="20"/>
         </w:rPr>
-        <w:t>Delivered 10+ Swift, UIKit, and Objective-C features across 20+ airline apps; refactored networking and core components to improve stability and load performance by approximately 15%.</w:t>
+        <w:t xml:space="preserve">Shipped </w:t>
       </w:r>
-    </w:p>
-    <w:p>
-      <w:pPr>
-        <w:keepNext/>
-        <w:tabs>
-          <w:tab w:pos="10225" w:val="right"/>
-        </w:tabs>
-        <w:spacing w:before="92" w:after="0" w:line="240" w:lineRule="auto"/>
-      </w:pPr>
       <w:r>
         <w:rPr>
-          <w:rFonts w:ascii="Georgia" w:hAnsi="Georgia"/>
+          <w:rFonts w:ascii="Arial" w:hAnsi="Arial"/>
           <w:b/>
           <w:i w:val="0"/>
           <w:color w:val="121212"/>
-          <w:sz w:val="21"/>
+          <w:sz w:val="20"/>
         </w:rPr>
-        <w:t>CSRN</w:t>
-      </w:r>
-      <w:r>
-        <w:rPr>
-          <w:rFonts w:ascii="Georgia" w:hAnsi="Georgia"/>
-          <w:b/>
-          <w:i w:val="0"/>
-          <w:color w:val="121212"/>
-          <w:sz w:val="21"/>
-        </w:rPr>
-        <w:tab/>
-        <w:t>Jun–Aug 2020</w:t>
-      </w:r>
-    </w:p>
-    <w:p>
-      <w:pPr>
-        <w:keepNext/>
-        <w:tabs>
-          <w:tab w:pos="10225" w:val="right"/>
-        </w:tabs>
-        <w:spacing w:before="0" w:after="52" w:line="240" w:lineRule="auto"/>
-      </w:pPr>
-      <w:r>
-        <w:rPr>
-          <w:rFonts w:ascii="Arial" w:hAnsi="Arial"/>
-          <w:b w:val="0"/>
-          <w:i/>
-          <w:color w:val="585858"/>
-          <w:sz w:val="19"/>
-        </w:rPr>
-        <w:t>Software Engineer Intern</w:t>
+        <w:t>10+ features</w:t>
       </w:r>
       <w:r>
         <w:rPr>
           <w:rFonts w:ascii="Arial" w:hAnsi="Arial"/>
           <w:b w:val="0"/>
-          <w:i/>
-          <w:color w:val="585858"/>
-          <w:sz w:val="19"/>
+          <w:i w:val="0"/>
+          <w:color w:val="121212"/>
+          <w:sz w:val="20"/>
         </w:rPr>
-        <w:tab/>
-        <w:t>London, UK</w:t>
+        <w:t xml:space="preserve"> in Swift, UIKit, and Objective-C for an airport-operations iOS app used by </w:t>
+      </w:r>
+      <w:r>
+        <w:rPr>
+          <w:rFonts w:ascii="Arial" w:hAnsi="Arial"/>
+          <w:b/>
+          <w:i w:val="0"/>
+          <w:color w:val="121212"/>
+          <w:sz w:val="20"/>
+        </w:rPr>
+        <w:t>20+ airlines</w:t>
+      </w:r>
+      <w:r>
+        <w:rPr>
+          <w:rFonts w:ascii="Arial" w:hAnsi="Arial"/>
+          <w:b w:val="0"/>
+          <w:i w:val="0"/>
+          <w:color w:val="121212"/>
+          <w:sz w:val="20"/>
+        </w:rPr>
+        <w:t xml:space="preserve"> for check-in, baggage, and flight schedules.</w:t>
       </w:r>
     </w:p>
     <w:p>
@@ -638,7 +1047,27 @@
           <w:color w:val="121212"/>
           <w:sz w:val="20"/>
         </w:rPr>
-        <w:t>Built a project-management prototype with distributed teams across multiple countries.</w:t>
+        <w:t xml:space="preserve">Refactored networking and core components to fix stability issues, improving load performance by </w:t>
+      </w:r>
+      <w:r>
+        <w:rPr>
+          <w:rFonts w:ascii="Arial" w:hAnsi="Arial"/>
+          <w:b/>
+          <w:i w:val="0"/>
+          <w:color w:val="121212"/>
+          <w:sz w:val="20"/>
+        </w:rPr>
+        <w:t>~15%</w:t>
+      </w:r>
+      <w:r>
+        <w:rPr>
+          <w:rFonts w:ascii="Arial" w:hAnsi="Arial"/>
+          <w:b w:val="0"/>
+          <w:i w:val="0"/>
+          <w:color w:val="121212"/>
+          <w:sz w:val="20"/>
+        </w:rPr>
+        <w:t>.</w:t>
       </w:r>
     </w:p>
     <w:p>
@@ -692,7 +1121,62 @@
           <w:color w:val="121212"/>
           <w:sz w:val="20"/>
         </w:rPr>
-        <w:t xml:space="preserve"> — Built and launched an AI ghostwriter for X as a solo product, spanning product design, a web app, browser extension, long-form writing, profile feedback, and image generation.</w:t>
+        <w:t xml:space="preserve">. AI ghostwriter for X that drafts in the user's voice. Designed, built, and launched it solo in </w:t>
+      </w:r>
+      <w:r>
+        <w:rPr>
+          <w:rFonts w:ascii="Arial" w:hAnsi="Arial"/>
+          <w:b/>
+          <w:i w:val="0"/>
+          <w:color w:val="121212"/>
+          <w:sz w:val="20"/>
+        </w:rPr>
+        <w:t>~6 weeks</w:t>
+      </w:r>
+      <w:r>
+        <w:rPr>
+          <w:rFonts w:ascii="Arial" w:hAnsi="Arial"/>
+          <w:b w:val="0"/>
+          <w:i w:val="0"/>
+          <w:color w:val="121212"/>
+          <w:sz w:val="20"/>
+        </w:rPr>
+        <w:t xml:space="preserve"> as a web app and Chrome extension with paid subscriptions.</w:t>
+      </w:r>
+    </w:p>
+    <w:p>
+      <w:pPr>
+        <w:spacing w:before="0" w:after="16" w:line="250" w:lineRule="auto"/>
+      </w:pPr>
+      <w:r>
+        <w:rPr>
+          <w:rFonts w:ascii="Georgia" w:hAnsi="Georgia"/>
+          <w:b/>
+          <w:i w:val="0"/>
+          <w:color w:val="121212"/>
+          <w:sz w:val="20"/>
+        </w:rPr>
+        <w:t>dex-notch</w:t>
+      </w:r>
+      <w:r>
+        <w:rPr>
+          <w:rFonts w:ascii="Arial" w:hAnsi="Arial"/>
+          <w:b w:val="0"/>
+          <w:i w:val="0"/>
+          <w:color w:val="585858"/>
+          <w:sz w:val="19"/>
+        </w:rPr>
+        <w:t xml:space="preserve"> · github.com/decocereus/dex-notch</w:t>
+      </w:r>
+      <w:r>
+        <w:rPr>
+          <w:rFonts w:ascii="Arial" w:hAnsi="Arial"/>
+          <w:b w:val="0"/>
+          <w:i w:val="0"/>
+          <w:color w:val="121212"/>
+          <w:sz w:val="20"/>
+        </w:rPr>
+        <w:t>. Native Swift macOS app that shows live AI-agent activity around the notch, released as a signed, notarized build with automatic updates.</w:t>
       </w:r>
     </w:p>
     <w:p>
@@ -727,7 +1211,7 @@
           <w:color w:val="121212"/>
           <w:sz w:val="20"/>
         </w:rPr>
-        <w:t xml:space="preserve"> — Built an open-source tool that converts public X posts and articles into Markdown, plain text, or JSON.</w:t>
+        <w:t>. Open-source web tool and CLI that turns X posts and articles into Markdown, text, or JSON for coding-agent workflows.</w:t>
       </w:r>
     </w:p>
     <w:p>
@@ -756,12 +1240,117 @@
       <w:r>
         <w:rPr>
           <w:rFonts w:ascii="Arial" w:hAnsi="Arial"/>
+          <w:b/>
+          <w:i w:val="0"/>
+          <w:color w:val="121212"/>
+          <w:sz w:val="19"/>
+        </w:rPr>
+        <w:t xml:space="preserve">Languages: </w:t>
+      </w:r>
+      <w:r>
+        <w:rPr>
+          <w:rFonts w:ascii="Arial" w:hAnsi="Arial"/>
           <w:b w:val="0"/>
           <w:i w:val="0"/>
           <w:color w:val="121212"/>
           <w:sz w:val="19"/>
         </w:rPr>
-        <w:t>TypeScript, JavaScript, React, Next.js, Node.js, PostgreSQL, Vite, shadcn/ui, Redux Toolkit, Express, REST APIs, WebSockets, npm package development, Puppeteer, Swift, UIKit, Objective-C</w:t>
+        <w:t xml:space="preserve">TypeScript, JavaScript, SQL, Swift, Objective-C  ·  </w:t>
+      </w:r>
+      <w:r>
+        <w:rPr>
+          <w:rFonts w:ascii="Arial" w:hAnsi="Arial"/>
+          <w:b/>
+          <w:i w:val="0"/>
+          <w:color w:val="121212"/>
+          <w:sz w:val="19"/>
+        </w:rPr>
+        <w:t xml:space="preserve">Tooling: </w:t>
+      </w:r>
+      <w:r>
+        <w:rPr>
+          <w:rFonts w:ascii="Arial" w:hAnsi="Arial"/>
+          <w:b w:val="0"/>
+          <w:i w:val="0"/>
+          <w:color w:val="121212"/>
+          <w:sz w:val="19"/>
+        </w:rPr>
+        <w:t>Vitest, Playwright, GitHub Actions, PostHog</w:t>
+      </w:r>
+    </w:p>
+    <w:p>
+      <w:pPr>
+        <w:spacing w:before="0" w:after="0" w:line="245" w:lineRule="auto"/>
+      </w:pPr>
+      <w:r>
+        <w:rPr>
+          <w:rFonts w:ascii="Arial" w:hAnsi="Arial"/>
+          <w:b/>
+          <w:i w:val="0"/>
+          <w:color w:val="121212"/>
+          <w:sz w:val="19"/>
+        </w:rPr>
+        <w:t xml:space="preserve">Frontend: </w:t>
+      </w:r>
+      <w:r>
+        <w:rPr>
+          <w:rFonts w:ascii="Arial" w:hAnsi="Arial"/>
+          <w:b w:val="0"/>
+          <w:i w:val="0"/>
+          <w:color w:val="121212"/>
+          <w:sz w:val="19"/>
+        </w:rPr>
+        <w:t>React, Next.js, TanStack Query, Tailwind CSS, shadcn/ui, Redux Toolkit, SwiftUI, UIKit</w:t>
+      </w:r>
+    </w:p>
+    <w:p>
+      <w:pPr>
+        <w:spacing w:before="0" w:after="0" w:line="245" w:lineRule="auto"/>
+      </w:pPr>
+      <w:r>
+        <w:rPr>
+          <w:rFonts w:ascii="Arial" w:hAnsi="Arial"/>
+          <w:b/>
+          <w:i w:val="0"/>
+          <w:color w:val="121212"/>
+          <w:sz w:val="19"/>
+        </w:rPr>
+        <w:t xml:space="preserve">Backend: </w:t>
+      </w:r>
+      <w:r>
+        <w:rPr>
+          <w:rFonts w:ascii="Arial" w:hAnsi="Arial"/>
+          <w:b w:val="0"/>
+          <w:i w:val="0"/>
+          <w:color w:val="121212"/>
+          <w:sz w:val="19"/>
+        </w:rPr>
+        <w:t>Node.js, Bun, Hono, Express, PostgreSQL, Drizzle ORM, REST APIs, WebSockets, event-driven workflows</w:t>
+      </w:r>
+    </w:p>
+    <w:p>
+      <w:pPr>
+        <w:spacing w:before="0" w:after="0" w:line="245" w:lineRule="auto"/>
+      </w:pPr>
+      <w:r>
+        <w:rPr>
+          <w:rFonts w:ascii="Arial" w:hAnsi="Arial"/>
+          <w:b/>
+          <w:i w:val="0"/>
+          <w:color w:val="121212"/>
+          <w:sz w:val="19"/>
+        </w:rPr>
+        <w:t xml:space="preserve">AI: </w:t>
+      </w:r>
+      <w:r>
+        <w:rPr>
+          <w:rFonts w:ascii="Arial" w:hAnsi="Arial"/>
+          <w:b w:val="0"/>
+          <w:i w:val="0"/>
+          <w:color w:val="121212"/>
+          <w:sz w:val="19"/>
+        </w:rPr>
+        <w:t>Claude Code, Codex, coding-agent workflows, LLM integration (Vercel AI SDK, OpenRouter), agent skills</w:t>
       </w:r>
     </w:p>
     <w:p>
@@ -780,7 +1369,7 @@
           <w:color w:val="121212"/>
           <w:sz w:val="23"/>
         </w:rPr>
-        <w:t>EDUCATION &amp; LEADERSHIP</w:t>
+        <w:t>EDUCATION</w:t>
       </w:r>
     </w:p>
     <w:p>
@@ -806,21 +1395,6 @@
           <w:sz w:val="20"/>
         </w:rPr>
         <w:t xml:space="preserve"> — B.Sc. (Hons) Computer Science, 2019–2022</w:t>
-      </w:r>
-    </w:p>
-    <w:p>
-      <w:pPr>
-        <w:spacing w:before="0" w:after="0" w:line="240" w:lineRule="auto"/>
-      </w:pPr>
-      <w:r>
-        <w:rPr>
-          <w:rFonts w:ascii="Arial" w:hAnsi="Arial"/>
-          <w:b w:val="0"/>
-          <w:i w:val="0"/>
-          <w:color w:val="585858"/>
-          <w:sz w:val="19"/>
-        </w:rPr>
-        <w:t>Founder-President, KCL Guitar Society · Head of Events, KCL Cyber Security Society · Travel Coordinator, KCL GloCiti</w:t>
       </w:r>
     </w:p>
     <w:sectPr>

</xml_diff>